<commit_message>
chore(lab1): report & ontology
</commit_message>
<xml_diff>
--- a/lab1/report.docx
+++ b/lab1/report.docx
@@ -2314,6 +2314,7 @@
           <w14:ligatures w14:val="none"/>
         </w:rPr>
       </w:pPr>
+      <w:proofErr w:type="gramStart"/>
       <w:r>
         <w:rPr>
           <w:rFonts w:ascii="Century Gothic" w:eastAsia="Times New Roman" w:hAnsi="Century Gothic" w:cs="Times New Roman"/>
@@ -2336,6 +2337,7 @@
         </w:rPr>
         <w:t>(</w:t>
       </w:r>
+      <w:proofErr w:type="gramEnd"/>
       <w:r>
         <w:rPr>
           <w:rFonts w:ascii="Century Gothic" w:eastAsia="Times New Roman" w:hAnsi="Century Gothic" w:cs="Times New Roman"/>
@@ -2421,6 +2423,7 @@
           <w14:ligatures w14:val="none"/>
         </w:rPr>
       </w:pPr>
+      <w:proofErr w:type="gramStart"/>
       <w:r>
         <w:rPr>
           <w:rFonts w:ascii="Century Gothic" w:eastAsia="Times New Roman" w:hAnsi="Century Gothic" w:cs="Times New Roman"/>
@@ -2443,6 +2446,7 @@
         </w:rPr>
         <w:t>(</w:t>
       </w:r>
+      <w:proofErr w:type="gramEnd"/>
       <w:r>
         <w:rPr>
           <w:rFonts w:ascii="Century Gothic" w:eastAsia="Times New Roman" w:hAnsi="Century Gothic" w:cs="Times New Roman"/>
@@ -2528,6 +2532,7 @@
           <w14:ligatures w14:val="none"/>
         </w:rPr>
       </w:pPr>
+      <w:proofErr w:type="gramStart"/>
       <w:r>
         <w:rPr>
           <w:rFonts w:ascii="Century Gothic" w:eastAsia="Times New Roman" w:hAnsi="Century Gothic" w:cs="Times New Roman"/>
@@ -2550,6 +2555,7 @@
         </w:rPr>
         <w:t>(</w:t>
       </w:r>
+      <w:proofErr w:type="gramEnd"/>
       <w:r>
         <w:rPr>
           <w:rFonts w:ascii="Century Gothic" w:eastAsia="Times New Roman" w:hAnsi="Century Gothic" w:cs="Times New Roman"/>
@@ -2622,6 +2628,7 @@
           <w14:ligatures w14:val="none"/>
         </w:rPr>
       </w:pPr>
+      <w:proofErr w:type="gramStart"/>
       <w:r>
         <w:rPr>
           <w:rFonts w:ascii="Century Gothic" w:eastAsia="Times New Roman" w:hAnsi="Century Gothic" w:cs="Times New Roman"/>
@@ -2644,6 +2651,7 @@
         </w:rPr>
         <w:t>(</w:t>
       </w:r>
+      <w:proofErr w:type="gramEnd"/>
       <w:r>
         <w:rPr>
           <w:rFonts w:ascii="Century Gothic" w:eastAsia="Times New Roman" w:hAnsi="Century Gothic" w:cs="Times New Roman"/>
@@ -2731,6 +2739,7 @@
           <w14:ligatures w14:val="none"/>
         </w:rPr>
       </w:pPr>
+      <w:proofErr w:type="gramStart"/>
       <w:r>
         <w:rPr>
           <w:rFonts w:ascii="Century Gothic" w:eastAsia="Times New Roman" w:hAnsi="Century Gothic" w:cs="Times New Roman"/>
@@ -2753,6 +2762,7 @@
         </w:rPr>
         <w:t>(</w:t>
       </w:r>
+      <w:proofErr w:type="gramEnd"/>
       <w:r>
         <w:rPr>
           <w:rFonts w:ascii="Century Gothic" w:eastAsia="Times New Roman" w:hAnsi="Century Gothic" w:cs="Times New Roman"/>
@@ -5411,6 +5421,7 @@
               </w:rPr>
             </w:pPr>
             <w:proofErr w:type="spellStart"/>
+            <w:proofErr w:type="gramStart"/>
             <w:r>
               <w:rPr>
                 <w:rStyle w:val="VerbatimChar"/>
@@ -5425,6 +5436,7 @@
               <w:t>(</w:t>
             </w:r>
             <w:proofErr w:type="spellStart"/>
+            <w:proofErr w:type="gramEnd"/>
             <w:r>
               <w:rPr>
                 <w:rStyle w:val="VerbatimChar"/>
@@ -5474,11 +5486,19 @@
               <w:t>[</w:t>
             </w:r>
             <w:proofErr w:type="spellStart"/>
+            <w:proofErr w:type="gramStart"/>
             <w:r>
               <w:rPr>
                 <w:rStyle w:val="VerbatimChar"/>
               </w:rPr>
-              <w:t>sheep,pig,chicken</w:t>
+              <w:t>sheep,pig</w:t>
+            </w:r>
+            <w:proofErr w:type="gramEnd"/>
+            <w:r>
+              <w:rPr>
+                <w:rStyle w:val="VerbatimChar"/>
+              </w:rPr>
+              <w:t>,chicken</w:t>
             </w:r>
             <w:proofErr w:type="spellEnd"/>
             <w:r>
@@ -5507,12 +5527,37 @@
                 <w:lang w:val="en-US" w:eastAsia="ru-RU"/>
               </w:rPr>
             </w:pPr>
+            <w:proofErr w:type="gramStart"/>
             <w:r>
               <w:rPr>
                 <w:rStyle w:val="VerbatimChar"/>
                 <w:lang w:val="en-US"/>
               </w:rPr>
-              <w:t>drops(sheep, Item), dropped(Item).</w:t>
+              <w:t>drops(</w:t>
+            </w:r>
+            <w:proofErr w:type="gramEnd"/>
+            <w:r>
+              <w:rPr>
+                <w:rStyle w:val="VerbatimChar"/>
+                <w:lang w:val="en-US"/>
+              </w:rPr>
+              <w:t xml:space="preserve">sheep, Item), </w:t>
+            </w:r>
+            <w:proofErr w:type="gramStart"/>
+            <w:r>
+              <w:rPr>
+                <w:rStyle w:val="VerbatimChar"/>
+                <w:lang w:val="en-US"/>
+              </w:rPr>
+              <w:t>dropped(</w:t>
+            </w:r>
+            <w:proofErr w:type="gramEnd"/>
+            <w:r>
+              <w:rPr>
+                <w:rStyle w:val="VerbatimChar"/>
+                <w:lang w:val="en-US"/>
+              </w:rPr>
+              <w:t>Item).</w:t>
             </w:r>
           </w:p>
         </w:tc>
@@ -5540,7 +5585,21 @@
               <w:rPr>
                 <w:rStyle w:val="VerbatimChar"/>
               </w:rPr>
-              <w:t>raw_mutton,white_wool</w:t>
+              <w:t>raw_</w:t>
+            </w:r>
+            <w:proofErr w:type="gramStart"/>
+            <w:r>
+              <w:rPr>
+                <w:rStyle w:val="VerbatimChar"/>
+              </w:rPr>
+              <w:t>mutton,white</w:t>
+            </w:r>
+            <w:proofErr w:type="gramEnd"/>
+            <w:r>
+              <w:rPr>
+                <w:rStyle w:val="VerbatimChar"/>
+              </w:rPr>
+              <w:t>_wool</w:t>
             </w:r>
             <w:proofErr w:type="spellEnd"/>
             <w:r>
@@ -5574,7 +5633,14 @@
               <w:rPr>
                 <w:rStyle w:val="VerbatimChar"/>
               </w:rPr>
-              <w:t>hostile_mob</w:t>
+              <w:t>hostile_</w:t>
+            </w:r>
+            <w:proofErr w:type="gramStart"/>
+            <w:r>
+              <w:rPr>
+                <w:rStyle w:val="VerbatimChar"/>
+              </w:rPr>
+              <w:t>mob</w:t>
             </w:r>
             <w:proofErr w:type="spellEnd"/>
             <w:r>
@@ -5584,6 +5650,7 @@
               <w:t>(</w:t>
             </w:r>
             <w:proofErr w:type="spellStart"/>
+            <w:proofErr w:type="gramEnd"/>
             <w:r>
               <w:rPr>
                 <w:rStyle w:val="VerbatimChar"/>
@@ -5619,11 +5686,19 @@
               <w:t>[</w:t>
             </w:r>
             <w:proofErr w:type="spellStart"/>
+            <w:proofErr w:type="gramStart"/>
             <w:r>
               <w:rPr>
                 <w:rStyle w:val="VerbatimChar"/>
               </w:rPr>
-              <w:t>zombie,skeleton,zombie_piglin</w:t>
+              <w:t>zombie,skeleton</w:t>
+            </w:r>
+            <w:proofErr w:type="gramEnd"/>
+            <w:r>
+              <w:rPr>
+                <w:rStyle w:val="VerbatimChar"/>
+              </w:rPr>
+              <w:t>,zombie_piglin</w:t>
             </w:r>
             <w:proofErr w:type="spellEnd"/>
             <w:r>
@@ -5657,7 +5732,14 @@
               <w:rPr>
                 <w:rStyle w:val="VerbatimChar"/>
               </w:rPr>
-              <w:t>non_hostile_mob</w:t>
+              <w:t>non_hostile_</w:t>
+            </w:r>
+            <w:proofErr w:type="gramStart"/>
+            <w:r>
+              <w:rPr>
+                <w:rStyle w:val="VerbatimChar"/>
+              </w:rPr>
+              <w:t>mob</w:t>
             </w:r>
             <w:proofErr w:type="spellEnd"/>
             <w:r>
@@ -5667,6 +5749,7 @@
               <w:t>(</w:t>
             </w:r>
             <w:proofErr w:type="spellStart"/>
+            <w:proofErr w:type="gramEnd"/>
             <w:r>
               <w:rPr>
                 <w:rStyle w:val="VerbatimChar"/>
@@ -5702,13 +5785,29 @@
               <w:t>[</w:t>
             </w:r>
             <w:proofErr w:type="spellStart"/>
+            <w:proofErr w:type="gramStart"/>
             <w:r>
               <w:rPr>
                 <w:rStyle w:val="VerbatimChar"/>
               </w:rPr>
-              <w:t>sheep,pig,chicken,villager</w:t>
+              <w:t>sheep,pig</w:t>
+            </w:r>
+            <w:proofErr w:type="gramEnd"/>
+            <w:r>
+              <w:rPr>
+                <w:rStyle w:val="VerbatimChar"/>
+              </w:rPr>
+              <w:t>,</w:t>
+            </w:r>
+            <w:proofErr w:type="gramStart"/>
+            <w:r>
+              <w:rPr>
+                <w:rStyle w:val="VerbatimChar"/>
+              </w:rPr>
+              <w:t>chicken,villager</w:t>
             </w:r>
             <w:proofErr w:type="spellEnd"/>
+            <w:proofErr w:type="gramEnd"/>
             <w:r>
               <w:rPr>
                 <w:rStyle w:val="VerbatimChar"/>
@@ -5740,7 +5839,14 @@
               <w:rPr>
                 <w:rStyle w:val="VerbatimChar"/>
               </w:rPr>
-              <w:t>mob_dimension</w:t>
+              <w:t>mob_</w:t>
+            </w:r>
+            <w:proofErr w:type="gramStart"/>
+            <w:r>
+              <w:rPr>
+                <w:rStyle w:val="VerbatimChar"/>
+              </w:rPr>
+              <w:t>dimension</w:t>
             </w:r>
             <w:proofErr w:type="spellEnd"/>
             <w:r>
@@ -5750,6 +5856,7 @@
               <w:t>(</w:t>
             </w:r>
             <w:proofErr w:type="spellStart"/>
+            <w:proofErr w:type="gramEnd"/>
             <w:r>
               <w:rPr>
                 <w:rStyle w:val="VerbatimChar"/>
@@ -5800,6 +5907,7 @@
               <w:t>[sheep-</w:t>
             </w:r>
             <w:proofErr w:type="spellStart"/>
+            <w:proofErr w:type="gramStart"/>
             <w:r>
               <w:rPr>
                 <w:rStyle w:val="VerbatimChar"/>
@@ -5808,6 +5916,7 @@
               <w:t>overworld,pig</w:t>
             </w:r>
             <w:proofErr w:type="spellEnd"/>
+            <w:proofErr w:type="gramEnd"/>
             <w:r>
               <w:rPr>
                 <w:rStyle w:val="VerbatimChar"/>
@@ -5816,6 +5925,7 @@
               <w:t>-</w:t>
             </w:r>
             <w:proofErr w:type="spellStart"/>
+            <w:proofErr w:type="gramStart"/>
             <w:r>
               <w:rPr>
                 <w:rStyle w:val="VerbatimChar"/>
@@ -5824,6 +5934,7 @@
               <w:t>overworld,chicken</w:t>
             </w:r>
             <w:proofErr w:type="spellEnd"/>
+            <w:proofErr w:type="gramEnd"/>
             <w:r>
               <w:rPr>
                 <w:rStyle w:val="VerbatimChar"/>
@@ -5857,17 +5968,26 @@
                 <w:rStyle w:val="VerbatimChar"/>
                 <w:lang w:val="en-US"/>
               </w:rPr>
-              <w:t>item_dimension_from_structure</w:t>
-            </w:r>
-            <w:proofErr w:type="spellEnd"/>
+              <w:t>item_dimension_from_</w:t>
+            </w:r>
+            <w:proofErr w:type="gramStart"/>
             <w:r>
               <w:rPr>
                 <w:rStyle w:val="VerbatimChar"/>
                 <w:lang w:val="en-US"/>
               </w:rPr>
+              <w:t>structure</w:t>
+            </w:r>
+            <w:proofErr w:type="spellEnd"/>
+            <w:r>
+              <w:rPr>
+                <w:rStyle w:val="VerbatimChar"/>
+                <w:lang w:val="en-US"/>
+              </w:rPr>
               <w:t>(</w:t>
             </w:r>
             <w:proofErr w:type="spellStart"/>
+            <w:proofErr w:type="gramEnd"/>
             <w:r>
               <w:rPr>
                 <w:rStyle w:val="VerbatimChar"/>
@@ -5942,15 +6062,31 @@
                 <w:rStyle w:val="VerbatimChar"/>
                 <w:lang w:val="en-US"/>
               </w:rPr>
-              <w:t>available_item_in_dimension</w:t>
-            </w:r>
-            <w:proofErr w:type="spellEnd"/>
+              <w:t>available_item_in_</w:t>
+            </w:r>
+            <w:proofErr w:type="gramStart"/>
             <w:r>
               <w:rPr>
                 <w:rStyle w:val="VerbatimChar"/>
                 <w:lang w:val="en-US"/>
               </w:rPr>
-              <w:t>(Item, overworld).</w:t>
+              <w:t>dimension</w:t>
+            </w:r>
+            <w:proofErr w:type="spellEnd"/>
+            <w:r>
+              <w:rPr>
+                <w:rStyle w:val="VerbatimChar"/>
+                <w:lang w:val="en-US"/>
+              </w:rPr>
+              <w:t>(</w:t>
+            </w:r>
+            <w:proofErr w:type="gramEnd"/>
+            <w:r>
+              <w:rPr>
+                <w:rStyle w:val="VerbatimChar"/>
+                <w:lang w:val="en-US"/>
+              </w:rPr>
+              <w:t>Item, overworld).</w:t>
             </w:r>
           </w:p>
         </w:tc>
@@ -5978,7 +6114,55 @@
                 <w:rStyle w:val="VerbatimChar"/>
                 <w:lang w:val="en-US"/>
               </w:rPr>
-              <w:t>raw_mutton,white_wool,raw_chicken,carrot,golden_helmet</w:t>
+              <w:t>raw_</w:t>
+            </w:r>
+            <w:proofErr w:type="gramStart"/>
+            <w:r>
+              <w:rPr>
+                <w:rStyle w:val="VerbatimChar"/>
+                <w:lang w:val="en-US"/>
+              </w:rPr>
+              <w:t>mutton,white</w:t>
+            </w:r>
+            <w:proofErr w:type="gramEnd"/>
+            <w:r>
+              <w:rPr>
+                <w:rStyle w:val="VerbatimChar"/>
+                <w:lang w:val="en-US"/>
+              </w:rPr>
+              <w:t>_</w:t>
+            </w:r>
+            <w:proofErr w:type="gramStart"/>
+            <w:r>
+              <w:rPr>
+                <w:rStyle w:val="VerbatimChar"/>
+                <w:lang w:val="en-US"/>
+              </w:rPr>
+              <w:t>wool,raw</w:t>
+            </w:r>
+            <w:proofErr w:type="gramEnd"/>
+            <w:r>
+              <w:rPr>
+                <w:rStyle w:val="VerbatimChar"/>
+                <w:lang w:val="en-US"/>
+              </w:rPr>
+              <w:t>_</w:t>
+            </w:r>
+            <w:proofErr w:type="gramStart"/>
+            <w:r>
+              <w:rPr>
+                <w:rStyle w:val="VerbatimChar"/>
+                <w:lang w:val="en-US"/>
+              </w:rPr>
+              <w:t>chicken,carrot</w:t>
+            </w:r>
+            <w:proofErr w:type="gramEnd"/>
+            <w:r>
+              <w:rPr>
+                <w:rStyle w:val="VerbatimChar"/>
+                <w:lang w:val="en-US"/>
+              </w:rPr>
+              <w:t>,golden_helmet</w:t>
             </w:r>
             <w:proofErr w:type="spellEnd"/>
             <w:r>
@@ -7239,9 +7423,6 @@
         <w:t>связывающие сущности</w:t>
       </w:r>
       <w:r>
-        <w:rPr>
-          <w:lang w:val="en-US"/>
-        </w:rPr>
         <w:t>,</w:t>
       </w:r>
       <w:r>
@@ -7311,6 +7492,7 @@
         </w:rPr>
       </w:pPr>
       <w:proofErr w:type="spellStart"/>
+      <w:proofErr w:type="gramStart"/>
       <w:r>
         <w:rPr>
           <w:rFonts w:ascii="Century Gothic" w:eastAsia="Times New Roman" w:hAnsi="Century Gothic" w:cs="Courier New"/>
@@ -7335,6 +7517,7 @@
         <w:t>(</w:t>
       </w:r>
       <w:proofErr w:type="spellStart"/>
+      <w:proofErr w:type="gramEnd"/>
       <w:r>
         <w:rPr>
           <w:rFonts w:ascii="Century Gothic" w:eastAsia="Times New Roman" w:hAnsi="Century Gothic" w:cs="Courier New"/>
@@ -7431,6 +7614,7 @@
         </w:rPr>
       </w:pPr>
       <w:proofErr w:type="spellStart"/>
+      <w:proofErr w:type="gramStart"/>
       <w:r>
         <w:rPr>
           <w:rFonts w:ascii="Century Gothic" w:eastAsia="Times New Roman" w:hAnsi="Century Gothic" w:cs="Courier New"/>
@@ -7455,6 +7639,7 @@
         <w:t>(</w:t>
       </w:r>
       <w:proofErr w:type="spellStart"/>
+      <w:proofErr w:type="gramEnd"/>
       <w:r>
         <w:rPr>
           <w:rFonts w:ascii="Century Gothic" w:eastAsia="Times New Roman" w:hAnsi="Century Gothic" w:cs="Courier New"/>
@@ -7551,6 +7736,7 @@
         </w:rPr>
       </w:pPr>
       <w:proofErr w:type="spellStart"/>
+      <w:proofErr w:type="gramStart"/>
       <w:r>
         <w:rPr>
           <w:rFonts w:ascii="Century Gothic" w:eastAsia="Times New Roman" w:hAnsi="Century Gothic" w:cs="Courier New"/>
@@ -7575,6 +7761,7 @@
         <w:t>(</w:t>
       </w:r>
       <w:proofErr w:type="spellStart"/>
+      <w:proofErr w:type="gramEnd"/>
       <w:r>
         <w:rPr>
           <w:rFonts w:ascii="Century Gothic" w:eastAsia="Times New Roman" w:hAnsi="Century Gothic" w:cs="Courier New"/>
@@ -7671,6 +7858,7 @@
         </w:rPr>
       </w:pPr>
       <w:proofErr w:type="spellStart"/>
+      <w:proofErr w:type="gramStart"/>
       <w:r>
         <w:rPr>
           <w:rFonts w:ascii="Century Gothic" w:eastAsia="Times New Roman" w:hAnsi="Century Gothic" w:cs="Courier New"/>
@@ -7695,6 +7883,7 @@
         <w:t>(</w:t>
       </w:r>
       <w:proofErr w:type="spellStart"/>
+      <w:proofErr w:type="gramEnd"/>
       <w:r>
         <w:rPr>
           <w:rFonts w:ascii="Century Gothic" w:eastAsia="Times New Roman" w:hAnsi="Century Gothic" w:cs="Courier New"/>
@@ -7884,7 +8073,7 @@
           <w:kern w:val="0"/>
           <w:sz w:val="28"/>
           <w:szCs w:val="28"/>
-          <w:lang w:val="en-US" w:eastAsia="ru-RU"/>
+          <w:lang w:eastAsia="ru-RU"/>
           <w14:ligatures w14:val="none"/>
         </w:rPr>
       </w:pPr>
@@ -10357,6 +10546,7 @@
                 <w:szCs w:val="21"/>
               </w:rPr>
             </w:pPr>
+            <w:proofErr w:type="gramStart"/>
             <w:r>
               <w:rPr>
                 <w:rFonts w:ascii="Century Gothic" w:hAnsi="Century Gothic"/>
@@ -10376,6 +10566,7 @@
               <w:t>PassiveMob</w:t>
             </w:r>
             <w:proofErr w:type="spellEnd"/>
+            <w:proofErr w:type="gramEnd"/>
           </w:p>
         </w:tc>
         <w:tc>
@@ -10486,6 +10677,7 @@
                 <w:szCs w:val="21"/>
               </w:rPr>
             </w:pPr>
+            <w:proofErr w:type="gramStart"/>
             <w:r>
               <w:rPr>
                 <w:rFonts w:ascii="Century Gothic" w:hAnsi="Century Gothic"/>
@@ -10505,6 +10697,7 @@
               <w:t>AggressiveMob</w:t>
             </w:r>
             <w:proofErr w:type="spellEnd"/>
+            <w:proofErr w:type="gramEnd"/>
           </w:p>
         </w:tc>
         <w:tc>
@@ -10588,6 +10781,7 @@
                 <w:lang w:val="en-US"/>
               </w:rPr>
             </w:pPr>
+            <w:proofErr w:type="gramStart"/>
             <w:r>
               <w:rPr>
                 <w:rFonts w:ascii="Century Gothic" w:hAnsi="Century Gothic"/>
@@ -10595,7 +10789,27 @@
                 <w:szCs w:val="21"/>
                 <w:lang w:val="en-US"/>
               </w:rPr>
-              <w:t>:Mob and (:</w:t>
+              <w:t>:Mob</w:t>
+            </w:r>
+            <w:proofErr w:type="gramEnd"/>
+            <w:r>
+              <w:rPr>
+                <w:rFonts w:ascii="Century Gothic" w:hAnsi="Century Gothic"/>
+                <w:sz w:val="21"/>
+                <w:szCs w:val="21"/>
+                <w:lang w:val="en-US"/>
+              </w:rPr>
+              <w:t xml:space="preserve"> and </w:t>
+            </w:r>
+            <w:proofErr w:type="gramStart"/>
+            <w:r>
+              <w:rPr>
+                <w:rFonts w:ascii="Century Gothic" w:hAnsi="Century Gothic"/>
+                <w:sz w:val="21"/>
+                <w:szCs w:val="21"/>
+                <w:lang w:val="en-US"/>
+              </w:rPr>
+              <w:t>(:</w:t>
             </w:r>
             <w:proofErr w:type="spellStart"/>
             <w:r>
@@ -10608,6 +10822,7 @@
               <w:t>spawnsIn</w:t>
             </w:r>
             <w:proofErr w:type="spellEnd"/>
+            <w:proofErr w:type="gramEnd"/>
             <w:r>
               <w:rPr>
                 <w:rFonts w:ascii="Century Gothic" w:hAnsi="Century Gothic"/>
@@ -10718,6 +10933,7 @@
                 <w:lang w:val="en-US"/>
               </w:rPr>
             </w:pPr>
+            <w:proofErr w:type="gramStart"/>
             <w:r>
               <w:rPr>
                 <w:rFonts w:ascii="Century Gothic" w:hAnsi="Century Gothic"/>
@@ -10725,7 +10941,27 @@
                 <w:szCs w:val="21"/>
                 <w:lang w:val="en-US"/>
               </w:rPr>
-              <w:t>:Biome and (:</w:t>
+              <w:t>:Biome</w:t>
+            </w:r>
+            <w:proofErr w:type="gramEnd"/>
+            <w:r>
+              <w:rPr>
+                <w:rFonts w:ascii="Century Gothic" w:hAnsi="Century Gothic"/>
+                <w:sz w:val="21"/>
+                <w:szCs w:val="21"/>
+                <w:lang w:val="en-US"/>
+              </w:rPr>
+              <w:t xml:space="preserve"> and </w:t>
+            </w:r>
+            <w:proofErr w:type="gramStart"/>
+            <w:r>
+              <w:rPr>
+                <w:rFonts w:ascii="Century Gothic" w:hAnsi="Century Gothic"/>
+                <w:sz w:val="21"/>
+                <w:szCs w:val="21"/>
+                <w:lang w:val="en-US"/>
+              </w:rPr>
+              <w:t>(:</w:t>
             </w:r>
             <w:proofErr w:type="spellStart"/>
             <w:r>
@@ -10738,6 +10974,7 @@
               <w:t>locatedIn</w:t>
             </w:r>
             <w:proofErr w:type="spellEnd"/>
+            <w:proofErr w:type="gramEnd"/>
             <w:r>
               <w:rPr>
                 <w:rFonts w:ascii="Century Gothic" w:hAnsi="Century Gothic"/>
@@ -10822,6 +11059,7 @@
                 <w:lang w:val="en-US"/>
               </w:rPr>
             </w:pPr>
+            <w:proofErr w:type="gramStart"/>
             <w:r>
               <w:rPr>
                 <w:rFonts w:ascii="Century Gothic" w:hAnsi="Century Gothic"/>
@@ -10829,7 +11067,57 @@
                 <w:szCs w:val="21"/>
                 <w:lang w:val="en-US"/>
               </w:rPr>
-              <w:t>:Item and (inverse :contains some :Structure)</w:t>
+              <w:t>:Item</w:t>
+            </w:r>
+            <w:proofErr w:type="gramEnd"/>
+            <w:r>
+              <w:rPr>
+                <w:rFonts w:ascii="Century Gothic" w:hAnsi="Century Gothic"/>
+                <w:sz w:val="21"/>
+                <w:szCs w:val="21"/>
+                <w:lang w:val="en-US"/>
+              </w:rPr>
+              <w:t xml:space="preserve"> and (</w:t>
+            </w:r>
+            <w:proofErr w:type="gramStart"/>
+            <w:r>
+              <w:rPr>
+                <w:rFonts w:ascii="Century Gothic" w:hAnsi="Century Gothic"/>
+                <w:sz w:val="21"/>
+                <w:szCs w:val="21"/>
+                <w:lang w:val="en-US"/>
+              </w:rPr>
+              <w:t>inverse :contains</w:t>
+            </w:r>
+            <w:proofErr w:type="gramEnd"/>
+            <w:r>
+              <w:rPr>
+                <w:rFonts w:ascii="Century Gothic" w:hAnsi="Century Gothic"/>
+                <w:sz w:val="21"/>
+                <w:szCs w:val="21"/>
+                <w:lang w:val="en-US"/>
+              </w:rPr>
+              <w:t xml:space="preserve"> </w:t>
+            </w:r>
+            <w:proofErr w:type="gramStart"/>
+            <w:r>
+              <w:rPr>
+                <w:rFonts w:ascii="Century Gothic" w:hAnsi="Century Gothic"/>
+                <w:sz w:val="21"/>
+                <w:szCs w:val="21"/>
+                <w:lang w:val="en-US"/>
+              </w:rPr>
+              <w:t>some :Structure</w:t>
+            </w:r>
+            <w:proofErr w:type="gramEnd"/>
+            <w:r>
+              <w:rPr>
+                <w:rFonts w:ascii="Century Gothic" w:hAnsi="Century Gothic"/>
+                <w:sz w:val="21"/>
+                <w:szCs w:val="21"/>
+                <w:lang w:val="en-US"/>
+              </w:rPr>
+              <w:t>)</w:t>
             </w:r>
           </w:p>
         </w:tc>
@@ -10932,6 +11220,7 @@
                 <w:lang w:val="en-US"/>
               </w:rPr>
             </w:pPr>
+            <w:proofErr w:type="gramStart"/>
             <w:r>
               <w:rPr>
                 <w:rFonts w:ascii="Century Gothic" w:hAnsi="Century Gothic"/>
@@ -10939,7 +11228,27 @@
                 <w:szCs w:val="21"/>
                 <w:lang w:val="en-US"/>
               </w:rPr>
-              <w:t>:Structure and (:</w:t>
+              <w:t>:Structure</w:t>
+            </w:r>
+            <w:proofErr w:type="gramEnd"/>
+            <w:r>
+              <w:rPr>
+                <w:rFonts w:ascii="Century Gothic" w:hAnsi="Century Gothic"/>
+                <w:sz w:val="21"/>
+                <w:szCs w:val="21"/>
+                <w:lang w:val="en-US"/>
+              </w:rPr>
+              <w:t xml:space="preserve"> and </w:t>
+            </w:r>
+            <w:proofErr w:type="gramStart"/>
+            <w:r>
+              <w:rPr>
+                <w:rFonts w:ascii="Century Gothic" w:hAnsi="Century Gothic"/>
+                <w:sz w:val="21"/>
+                <w:szCs w:val="21"/>
+                <w:lang w:val="en-US"/>
+              </w:rPr>
+              <w:t>(:</w:t>
             </w:r>
             <w:proofErr w:type="spellStart"/>
             <w:r>
@@ -10952,6 +11261,7 @@
               <w:t>generatesIn</w:t>
             </w:r>
             <w:proofErr w:type="spellEnd"/>
+            <w:proofErr w:type="gramEnd"/>
             <w:r>
               <w:rPr>
                 <w:rFonts w:ascii="Century Gothic" w:hAnsi="Century Gothic"/>
@@ -10959,7 +11269,17 @@
                 <w:szCs w:val="21"/>
                 <w:lang w:val="en-US"/>
               </w:rPr>
-              <w:t xml:space="preserve"> some (:</w:t>
+              <w:t xml:space="preserve"> some </w:t>
+            </w:r>
+            <w:proofErr w:type="gramStart"/>
+            <w:r>
+              <w:rPr>
+                <w:rFonts w:ascii="Century Gothic" w:hAnsi="Century Gothic"/>
+                <w:sz w:val="21"/>
+                <w:szCs w:val="21"/>
+                <w:lang w:val="en-US"/>
+              </w:rPr>
+              <w:t>(:</w:t>
             </w:r>
             <w:proofErr w:type="spellStart"/>
             <w:r>
@@ -10972,6 +11292,7 @@
               <w:t>locatedIn</w:t>
             </w:r>
             <w:proofErr w:type="spellEnd"/>
+            <w:proofErr w:type="gramEnd"/>
             <w:r>
               <w:rPr>
                 <w:rFonts w:ascii="Century Gothic" w:hAnsi="Century Gothic"/>
@@ -10979,7 +11300,27 @@
                 <w:szCs w:val="21"/>
                 <w:lang w:val="en-US"/>
               </w:rPr>
-              <w:t xml:space="preserve"> value :overworld))</w:t>
+              <w:t xml:space="preserve"> </w:t>
+            </w:r>
+            <w:proofErr w:type="gramStart"/>
+            <w:r>
+              <w:rPr>
+                <w:rFonts w:ascii="Century Gothic" w:hAnsi="Century Gothic"/>
+                <w:sz w:val="21"/>
+                <w:szCs w:val="21"/>
+                <w:lang w:val="en-US"/>
+              </w:rPr>
+              <w:t>value :overworld</w:t>
+            </w:r>
+            <w:proofErr w:type="gramEnd"/>
+            <w:r>
+              <w:rPr>
+                <w:rFonts w:ascii="Century Gothic" w:hAnsi="Century Gothic"/>
+                <w:sz w:val="21"/>
+                <w:szCs w:val="21"/>
+                <w:lang w:val="en-US"/>
+              </w:rPr>
+              <w:t>))</w:t>
             </w:r>
           </w:p>
         </w:tc>
@@ -11588,6 +11929,7 @@
               <w:t xml:space="preserve"> </w:t>
             </w:r>
             <w:proofErr w:type="spellStart"/>
+            <w:proofErr w:type="gramStart"/>
             <w:r>
               <w:rPr>
                 <w:rFonts w:ascii="Century Gothic" w:eastAsia="Times New Roman" w:hAnsi="Century Gothic" w:cs="Courier New"/>
@@ -11600,6 +11942,7 @@
               <w:t>rdf:type</w:t>
             </w:r>
             <w:proofErr w:type="spellEnd"/>
+            <w:proofErr w:type="gramEnd"/>
             <w:r>
               <w:rPr>
                 <w:rFonts w:ascii="Century Gothic" w:eastAsia="Times New Roman" w:hAnsi="Century Gothic" w:cs="Courier New"/>
@@ -11798,6 +12141,7 @@
               <w:t xml:space="preserve"> </w:t>
             </w:r>
             <w:proofErr w:type="spellStart"/>
+            <w:proofErr w:type="gramStart"/>
             <w:r>
               <w:rPr>
                 <w:rFonts w:ascii="Century Gothic" w:eastAsia="Times New Roman" w:hAnsi="Century Gothic" w:cs="Courier New"/>
@@ -11810,6 +12154,7 @@
               <w:t>rdf:type</w:t>
             </w:r>
             <w:proofErr w:type="spellEnd"/>
+            <w:proofErr w:type="gramEnd"/>
             <w:r>
               <w:rPr>
                 <w:rFonts w:ascii="Century Gothic" w:eastAsia="Times New Roman" w:hAnsi="Century Gothic" w:cs="Courier New"/>
@@ -12008,6 +12353,7 @@
               <w:t xml:space="preserve"> </w:t>
             </w:r>
             <w:proofErr w:type="spellStart"/>
+            <w:proofErr w:type="gramStart"/>
             <w:r>
               <w:rPr>
                 <w:rFonts w:ascii="Century Gothic" w:eastAsia="Times New Roman" w:hAnsi="Century Gothic" w:cs="Courier New"/>
@@ -12020,6 +12366,7 @@
               <w:t>rdf:type</w:t>
             </w:r>
             <w:proofErr w:type="spellEnd"/>
+            <w:proofErr w:type="gramEnd"/>
             <w:r>
               <w:rPr>
                 <w:rFonts w:ascii="Century Gothic" w:eastAsia="Times New Roman" w:hAnsi="Century Gothic" w:cs="Courier New"/>
@@ -12103,6 +12450,7 @@
               <w:t xml:space="preserve">  </w:t>
             </w:r>
             <w:proofErr w:type="spellStart"/>
+            <w:proofErr w:type="gramStart"/>
             <w:r>
               <w:rPr>
                 <w:rFonts w:ascii="Century Gothic" w:eastAsia="Times New Roman" w:hAnsi="Century Gothic" w:cs="Courier New"/>
@@ -12127,6 +12475,7 @@
               <w:t>(</w:t>
             </w:r>
             <w:proofErr w:type="spellStart"/>
+            <w:proofErr w:type="gramEnd"/>
             <w:r>
               <w:rPr>
                 <w:rFonts w:ascii="Century Gothic" w:eastAsia="Times New Roman" w:hAnsi="Century Gothic" w:cs="Courier New"/>
@@ -12345,6 +12694,7 @@
               </w:rPr>
             </w:pPr>
             <w:proofErr w:type="spellStart"/>
+            <w:proofErr w:type="gramStart"/>
             <w:r>
               <w:rPr>
                 <w:rFonts w:ascii="Century Gothic" w:eastAsia="Times New Roman" w:hAnsi="Century Gothic" w:cs="Courier New"/>
@@ -12369,6 +12719,7 @@
               <w:t>(</w:t>
             </w:r>
             <w:proofErr w:type="spellStart"/>
+            <w:proofErr w:type="gramEnd"/>
             <w:r>
               <w:rPr>
                 <w:rFonts w:ascii="Century Gothic" w:eastAsia="Times New Roman" w:hAnsi="Century Gothic" w:cs="Courier New"/>
@@ -12576,6 +12927,7 @@
               </w:rPr>
             </w:pPr>
             <w:proofErr w:type="spellStart"/>
+            <w:proofErr w:type="gramStart"/>
             <w:r>
               <w:rPr>
                 <w:rFonts w:ascii="Century Gothic" w:eastAsia="Times New Roman" w:hAnsi="Century Gothic" w:cs="Courier New"/>
@@ -12600,6 +12952,7 @@
               <w:t>(</w:t>
             </w:r>
             <w:proofErr w:type="spellStart"/>
+            <w:proofErr w:type="gramEnd"/>
             <w:r>
               <w:rPr>
                 <w:rFonts w:ascii="Century Gothic" w:eastAsia="Times New Roman" w:hAnsi="Century Gothic" w:cs="Courier New"/>
@@ -12807,6 +13160,7 @@
               </w:rPr>
             </w:pPr>
             <w:proofErr w:type="spellStart"/>
+            <w:proofErr w:type="gramStart"/>
             <w:r>
               <w:rPr>
                 <w:rFonts w:ascii="Century Gothic" w:eastAsia="Times New Roman" w:hAnsi="Century Gothic" w:cs="Courier New"/>
@@ -12831,6 +13185,7 @@
               <w:t>(</w:t>
             </w:r>
             <w:proofErr w:type="spellStart"/>
+            <w:proofErr w:type="gramEnd"/>
             <w:r>
               <w:rPr>
                 <w:rFonts w:ascii="Century Gothic" w:eastAsia="Times New Roman" w:hAnsi="Century Gothic" w:cs="Courier New"/>
@@ -13214,6 +13569,7 @@
               <w:t xml:space="preserve"> </w:t>
             </w:r>
             <w:proofErr w:type="spellStart"/>
+            <w:proofErr w:type="gramStart"/>
             <w:r>
               <w:rPr>
                 <w:rFonts w:ascii="Century Gothic" w:hAnsi="Century Gothic"/>
@@ -13223,6 +13579,7 @@
               <w:t>rdf:type</w:t>
             </w:r>
             <w:proofErr w:type="spellEnd"/>
+            <w:proofErr w:type="gramEnd"/>
             <w:r>
               <w:rPr>
                 <w:rFonts w:ascii="Century Gothic" w:hAnsi="Century Gothic"/>
@@ -13339,6 +13696,7 @@
               <w:t xml:space="preserve"> </w:t>
             </w:r>
             <w:proofErr w:type="spellStart"/>
+            <w:proofErr w:type="gramStart"/>
             <w:r>
               <w:rPr>
                 <w:rFonts w:ascii="Century Gothic" w:hAnsi="Century Gothic"/>
@@ -13348,6 +13706,7 @@
               <w:t>rdf:type</w:t>
             </w:r>
             <w:proofErr w:type="spellEnd"/>
+            <w:proofErr w:type="gramEnd"/>
             <w:r>
               <w:rPr>
                 <w:rFonts w:ascii="Century Gothic" w:hAnsi="Century Gothic"/>
@@ -13448,13 +13807,90 @@
     </w:p>
     <w:p>
       <w:pPr>
+        <w:keepNext/>
+      </w:pPr>
+      <w:r>
         <w:rPr>
           <w:rFonts w:ascii="Segoe UI" w:hAnsi="Segoe UI" w:cs="Segoe UI"/>
           <w:b/>
           <w:bCs/>
-          <w:lang w:eastAsia="ru-RU"/>
-        </w:rPr>
-      </w:pPr>
+          <w:noProof/>
+          <w:lang w:eastAsia="ru-RU"/>
+        </w:rPr>
+        <w:lastRenderedPageBreak/>
+        <w:drawing>
+          <wp:inline distT="0" distB="0" distL="0" distR="0" wp14:anchorId="37BE8FE6" wp14:editId="64826118">
+            <wp:extent cx="6314498" cy="7360727"/>
+            <wp:effectExtent l="0" t="0" r="0" b="5715"/>
+            <wp:docPr id="334988218" name="Рисунок 3"/>
+            <wp:cNvGraphicFramePr>
+              <a:graphicFrameLocks xmlns:a="http://schemas.openxmlformats.org/drawingml/2006/main" noChangeAspect="1"/>
+            </wp:cNvGraphicFramePr>
+            <a:graphic xmlns:a="http://schemas.openxmlformats.org/drawingml/2006/main">
+              <a:graphicData uri="http://schemas.openxmlformats.org/drawingml/2006/picture">
+                <pic:pic xmlns:pic="http://schemas.openxmlformats.org/drawingml/2006/picture">
+                  <pic:nvPicPr>
+                    <pic:cNvPr id="334988218" name="Рисунок 334988218"/>
+                    <pic:cNvPicPr/>
+                  </pic:nvPicPr>
+                  <pic:blipFill>
+                    <a:blip r:embed="rId12">
+                      <a:extLst>
+                        <a:ext uri="{28A0092B-C50C-407E-A947-70E740481C1C}">
+                          <a14:useLocalDpi xmlns:a14="http://schemas.microsoft.com/office/drawing/2010/main" val="0"/>
+                        </a:ext>
+                      </a:extLst>
+                    </a:blip>
+                    <a:stretch>
+                      <a:fillRect/>
+                    </a:stretch>
+                  </pic:blipFill>
+                  <pic:spPr>
+                    <a:xfrm>
+                      <a:off x="0" y="0"/>
+                      <a:ext cx="6342326" cy="7393166"/>
+                    </a:xfrm>
+                    <a:prstGeom prst="rect">
+                      <a:avLst/>
+                    </a:prstGeom>
+                  </pic:spPr>
+                </pic:pic>
+              </a:graphicData>
+            </a:graphic>
+          </wp:inline>
+        </w:drawing>
+      </w:r>
+    </w:p>
+    <w:p>
+      <w:pPr>
+        <w:pStyle w:val="ad"/>
+        <w:rPr>
+          <w:rFonts w:ascii="Segoe UI" w:hAnsi="Segoe UI" w:cs="Segoe UI"/>
+          <w:b/>
+          <w:bCs/>
+          <w:lang w:eastAsia="ru-RU"/>
+        </w:rPr>
+      </w:pPr>
+      <w:r>
+        <w:t xml:space="preserve">Рис. </w:t>
+      </w:r>
+      <w:fldSimple w:instr=" SEQ Рис. \* ARABIC ">
+        <w:r>
+          <w:rPr>
+            <w:noProof/>
+          </w:rPr>
+          <w:t>6</w:t>
+        </w:r>
+      </w:fldSimple>
+      <w:r>
+        <w:rPr>
+          <w:lang w:val="en-US"/>
+        </w:rPr>
+        <w:t xml:space="preserve"> - </w:t>
+      </w:r>
+      <w:r>
+        <w:t>Онтологический граф</w:t>
+      </w:r>
     </w:p>
     <w:sectPr>
       <w:pgSz w:w="11906" w:h="16838"/>

</xml_diff>